<commit_message>
Actualizar informe Fase 3 con el detalle por clic y compra/fabricación en Centros de trabajo
Ya no aparece en "Falta" — se movió a "Se hizo" y se sacó la pregunta
que quedó respondida.

Co-Authored-By: Claude Sonnet 5 <noreply@anthropic.com>
</commit_message>
<xml_diff>
--- a/docs/entregables/REINER - Fase 3 - Estado de avance.docx
+++ b/docs/entregables/REINER - Fase 3 - Estado de avance.docx
@@ -211,7 +211,7 @@
           <w:sz w:val="20"/>
           <w:szCs w:val="20"/>
         </w:rPr>
-        <w:t xml:space="preserve">Centros de trabajo: reordenar arrastrando con el dedo o el mouse, en vez de flechas.</w:t>
+        <w:t xml:space="preserve">Centros de trabajo: reordenar arrastrando con el dedo o el mouse, en vez de flechas; clic en cualquier pieza para ver su detalle completo (operación actual, si está asignada y a quién); sección aparte para las piezas de compra pendientes, que antes no se veían en ningún lado.</w:t>
       </w:r>
     </w:p>
     <w:p>
@@ -379,25 +379,6 @@
           <w:sz w:val="20"/>
           <w:szCs w:val="20"/>
         </w:rPr>
-        <w:t xml:space="preserve">Centros de trabajo: poder hacer clic en una tarea para ver más detalle, y separar ahí mismo piezas de fabricación vs. de compra.</w:t>
-      </w:r>
-    </w:p>
-    <w:p>
-      <w:pPr>
-        <w:pStyle w:val="ListParagraph"/>
-        <w:numPr>
-          <w:ilvl w:val="0"/>
-          <w:numId w:val="2"/>
-        </w:numPr>
-        <w:spacing w:after="60"/>
-      </w:pPr>
-      <w:r>
-        <w:rPr>
-          <w:rFonts w:ascii="Calibri" w:cs="Calibri" w:eastAsia="Calibri" w:hAnsi="Calibri"/>
-          <w:color w:val="16232B"/>
-          <w:sz w:val="20"/>
-          <w:szCs w:val="20"/>
-        </w:rPr>
         <w:t xml:space="preserve">Confirmar si "el trabajo se pierde de vista al mandarlo a fabricación" sigue pasando — no lo pudimos reproducir con todo lo nuevo, puede que ya esté resuelto.</w:t>
       </w:r>
     </w:p>
@@ -489,7 +470,7 @@
           <w:sz w:val="20"/>
           <w:szCs w:val="20"/>
         </w:rPr>
-        <w:t xml:space="preserve">Centros de trabajo: ¿hace falta el detalle por clic y separar compra/fabricación ahí mismo, o alcanza con verlo en Maestros y Stock?</w:t>
+        <w:t xml:space="preserve">Adjuntos: ¿qué tipo de archivos (planos, fotos, PDF) y para qué operaciones puntuales conviene empezar?</w:t>
       </w:r>
     </w:p>
     <w:p>
@@ -506,31 +487,6 @@
           <w:szCs w:val="20"/>
         </w:rPr>
         <w:t xml:space="preserve">4. </w:t>
-      </w:r>
-      <w:r>
-        <w:rPr>
-          <w:rFonts w:ascii="Calibri" w:cs="Calibri" w:eastAsia="Calibri" w:hAnsi="Calibri"/>
-          <w:color w:val="16232B"/>
-          <w:sz w:val="20"/>
-          <w:szCs w:val="20"/>
-        </w:rPr>
-        <w:t xml:space="preserve">Adjuntos: ¿qué tipo de archivos (planos, fotos, PDF) y para qué operaciones puntuales conviene empezar?</w:t>
-      </w:r>
-    </w:p>
-    <w:p>
-      <w:pPr>
-        <w:spacing w:after="100"/>
-      </w:pPr>
-      <w:r>
-        <w:rPr>
-          <w:rFonts w:ascii="Calibri" w:cs="Calibri" w:eastAsia="Calibri" w:hAnsi="Calibri"/>
-          <w:b/>
-          <w:bCs/>
-          <w:color w:val="0075A4"/>
-          <w:sz w:val="20"/>
-          <w:szCs w:val="20"/>
-        </w:rPr>
-        <w:t xml:space="preserve">5. </w:t>
       </w:r>
       <w:r>
         <w:rPr>

</xml_diff>